<commit_message>
Update QA test documentation
</commit_message>
<xml_diff>
--- a/test-plan/Test_Plan.docx
+++ b/test-plan/Test_Plan.docx
@@ -86,7 +86,7 @@
                 <w:b/>
                 <w:sz w:val="20"/>
               </w:rPr>
-              <w:t>Testing</w:t>
+              <w:t>Testing Type</w:t>
             </w:r>
           </w:p>
         </w:tc>
@@ -103,7 +103,7 @@
                 <w:b w:val="0"/>
                 <w:sz w:val="20"/>
               </w:rPr>
-              <w:t>Manual testing</w:t>
+              <w:t>Manual Testing</w:t>
             </w:r>
           </w:p>
         </w:tc>
@@ -305,7 +305,7 @@
         <w:spacing w:after="30"/>
       </w:pPr>
       <w:r>
-        <w:t>Checkout (partially)</w:t>
+        <w:t>Checkout (partial testing)</w:t>
       </w:r>
     </w:p>
     <w:p>
@@ -530,7 +530,7 @@
         <w:keepNext/>
       </w:pPr>
       <w:r>
-        <w:t>7. Before Testing</w:t>
+        <w:t>7. Test Preconditions</w:t>
       </w:r>
     </w:p>
     <w:p>
@@ -602,7 +602,7 @@
         <w:spacing w:after="30"/>
       </w:pPr>
       <w:r>
-        <w:t>Blocked checks are marked as Blocked.</w:t>
+        <w:t>Test results are marked as Passed, Failed, or Blocked when applicable.</w:t>
       </w:r>
     </w:p>
     <w:p>

</xml_diff>